<commit_message>
Fix member visibility and audit loading
</commit_message>
<xml_diff>
--- a/test-kit/Beplan全系统人工验收测试手册_V2.0.docx
+++ b/test-kit/Beplan全系统人工验收测试手册_V2.0.docx
@@ -156,7 +156,7 @@
                 <w:color w:val="17243A"/>
                 <w:sz w:val="18"/>
               </w:rPr>
-              <w:t>V2.0</w:t>
+              <w:t>V2.1</w:t>
             </w:r>
           </w:p>
         </w:tc>
@@ -176,7 +176,7 @@
                 <w:color w:val="17243A"/>
                 <w:sz w:val="18"/>
               </w:rPr>
-              <w:t>2026-08-11</w:t>
+              <w:t>2026-08-12</w:t>
             </w:r>
           </w:p>
         </w:tc>
@@ -196,7 +196,7 @@
                 <w:color w:val="17243A"/>
                 <w:sz w:val="18"/>
               </w:rPr>
-              <w:t>Supabase 托管云 + Vercel</w:t>
+              <w:t>Supabase 托管云 + GitHub Pages</w:t>
             </w:r>
           </w:p>
         </w:tc>
@@ -251,7 +251,7 @@
               <w:t xml:space="preserve">测试地址  </w:t>
             </w:r>
             <w:r>
-              <w:t>https://beplan-caseops-uat.vercel.app</w:t>
+              <w:t>https://chenguanyu-cgy.github.io</w:t>
             </w:r>
           </w:p>
         </w:tc>

</xml_diff>